<commit_message>
Update AquiferOpenBibleDictionary data for 2026-09-14 release
</commit_message>
<xml_diff>
--- a/fra/docx/002.content.docx
+++ b/fra/docx/002.content.docx
@@ -21832,6 +21832,125 @@
         <w:rPr>
           <w:lang w:val="fr_FR" w:bidi="fr_FR"/>
         </w:rPr>
+        <w:t>bélier de consécration</w:t>
+      </w:r>
+      <w:r>
+        <w:rPr>
+          <w:lang w:val="fr_FR" w:bidi="fr_FR"/>
+        </w:rPr>
+      </w:r>
+    </w:p>
+    <w:p>
+      <w:pPr/>
+      <w:r>
+        <w:rPr>
+          <w:lang w:val="fr_FR" w:bidi="fr_FR"/>
+        </w:rPr>
+      </w:r>
+      <w:r>
+        <w:rPr>
+          <w:lang w:val="fr_FR" w:bidi="fr_FR"/>
+        </w:rPr>
+        <w:t xml:space="preserve">Appelé « bélier d'investiture » dans certaines versions françaises. Ce bélier était présenté en sacrifice pour consacrer les sacrificateurs au service de Dieu. </w:t>
+      </w:r>
+    </w:p>
+    <w:p>
+      <w:pPr/>
+      <w:r>
+        <w:rPr>
+          <w:lang w:val="fr_FR" w:bidi="fr_FR"/>
+        </w:rPr>
+      </w:r>
+      <w:r>
+        <w:rPr>
+          <w:lang w:val="fr_FR" w:bidi="fr_FR"/>
+        </w:rPr>
+        <w:t>Il est mentionné notamment dans le contexte de la cérémonie d'investiture d'Aaron et de ses fils comme sacrificateurs (</w:t>
+      </w:r>
+      <w:r>
+        <w:rPr>
+          <w:lang w:val="fr_FR" w:bidi="fr_FR"/>
+        </w:rPr>
+        <w:t>Ex 29.1–37</w:t>
+      </w:r>
+      <w:r>
+        <w:rPr>
+          <w:lang w:val="fr_FR" w:bidi="fr_FR"/>
+        </w:rPr>
+        <w:t xml:space="preserve"> ; </w:t>
+      </w:r>
+      <w:r>
+        <w:rPr>
+          <w:lang w:val="fr_FR" w:bidi="fr_FR"/>
+        </w:rPr>
+        <w:t>Lv 8.1–36</w:t>
+      </w:r>
+      <w:r>
+        <w:rPr>
+          <w:lang w:val="fr_FR" w:bidi="fr_FR"/>
+        </w:rPr>
+        <w:t>).</w:t>
+      </w:r>
+    </w:p>
+    <w:p>
+      <w:pPr/>
+      <w:r>
+        <w:rPr>
+          <w:lang w:val="fr_FR" w:bidi="fr_FR"/>
+        </w:rPr>
+      </w:r>
+      <w:r>
+        <w:rPr>
+          <w:i/>
+          <w:lang w:val="fr_FR" w:bidi="fr_FR"/>
+        </w:rPr>
+        <w:t>Voir</w:t>
+      </w:r>
+      <w:r>
+        <w:rPr>
+          <w:lang w:val="fr_FR" w:bidi="fr_FR"/>
+        </w:rPr>
+        <w:t xml:space="preserve"> </w:t>
+      </w:r>
+      <w:r>
+        <w:rPr>
+          <w:lang w:val="fr_FR" w:bidi="fr_FR"/>
+        </w:rPr>
+        <w:t>offrandes et sacrifices</w:t>
+      </w:r>
+      <w:r>
+        <w:rPr>
+          <w:lang w:val="fr_FR" w:bidi="fr_FR"/>
+        </w:rPr>
+        <w:t>.</w:t>
+      </w:r>
+      <w:r>
+        <w:rPr>
+          <w:lang w:val="fr_FR" w:bidi="fr_FR"/>
+        </w:rPr>
+      </w:r>
+      <w:r>
+        <w:rPr>
+          <w:lang w:val="fr_FR" w:bidi="fr_FR"/>
+        </w:rPr>
+      </w:r>
+    </w:p>
+    <w:p>
+      <w:pPr/>
+      <w:r>
+        <w:rPr>
+          <w:lang w:val="fr_FR" w:bidi="fr_FR"/>
+        </w:rPr>
+      </w:r>
+    </w:p>
+    <w:p>
+      <w:pPr>
+        <w:pStyle w:val="Heading2"/>
+      </w:pPr>
+      <w:r>
+        <w:rPr>
+          <w:lang w:val="fr_FR" w:bidi="fr_FR"/>
+        </w:rPr>
         <w:t>bélier (machine de guerre)</w:t>
       </w:r>
       <w:r>
@@ -57640,6 +57759,99 @@
           <w:lang w:val="fr_FR" w:bidi="fr_FR"/>
         </w:rPr>
         <w:t>Expiations, Jour des</w:t>
+      </w:r>
+      <w:r>
+        <w:rPr>
+          <w:lang w:val="fr_FR" w:bidi="fr_FR"/>
+        </w:rPr>
+        <w:t>.</w:t>
+      </w:r>
+      <w:r>
+        <w:rPr>
+          <w:lang w:val="fr_FR" w:bidi="fr_FR"/>
+        </w:rPr>
+      </w:r>
+      <w:r>
+        <w:rPr>
+          <w:lang w:val="fr_FR" w:bidi="fr_FR"/>
+        </w:rPr>
+      </w:r>
+    </w:p>
+    <w:p>
+      <w:pPr/>
+      <w:r>
+        <w:rPr>
+          <w:lang w:val="fr_FR" w:bidi="fr_FR"/>
+        </w:rPr>
+      </w:r>
+    </w:p>
+    <w:p>
+      <w:pPr>
+        <w:pStyle w:val="Heading2"/>
+      </w:pPr>
+      <w:r>
+        <w:rPr>
+          <w:lang w:val="fr_FR" w:bidi="fr_FR"/>
+        </w:rPr>
+        <w:t>boucle d’oreille</w:t>
+      </w:r>
+      <w:r>
+        <w:rPr>
+          <w:lang w:val="fr_FR" w:bidi="fr_FR"/>
+        </w:rPr>
+      </w:r>
+    </w:p>
+    <w:p>
+      <w:pPr/>
+      <w:r>
+        <w:rPr>
+          <w:lang w:val="fr_FR" w:bidi="fr_FR"/>
+        </w:rPr>
+      </w:r>
+      <w:r>
+        <w:rPr>
+          <w:lang w:val="fr_FR" w:bidi="fr_FR"/>
+        </w:rPr>
+        <w:t xml:space="preserve">Bijou en forme de boucle qui se porte à l’oreille. </w:t>
+      </w:r>
+      <w:r>
+        <w:rPr>
+          <w:lang w:val="fr_FR" w:bidi="fr_FR"/>
+        </w:rPr>
+        <w:t>Exode 32.2</w:t>
+      </w:r>
+      <w:r>
+        <w:rPr>
+          <w:lang w:val="fr_FR" w:bidi="fr_FR"/>
+        </w:rPr>
+        <w:t xml:space="preserve"> mentionne des anneaux d'or que portaient des hommes et des femmes. Ces anneaux pouvaient être faits en or ou en d’autres matériaux précieux. Ils servaient de parure, ainsi que de signes de richesse.</w:t>
+      </w:r>
+    </w:p>
+    <w:p>
+      <w:pPr/>
+      <w:r>
+        <w:rPr>
+          <w:lang w:val="fr_FR" w:bidi="fr_FR"/>
+        </w:rPr>
+      </w:r>
+      <w:r>
+        <w:rPr>
+          <w:i/>
+          <w:lang w:val="fr_FR" w:bidi="fr_FR"/>
+        </w:rPr>
+        <w:t>Voir</w:t>
+      </w:r>
+      <w:r>
+        <w:rPr>
+          <w:lang w:val="fr_FR" w:bidi="fr_FR"/>
+        </w:rPr>
+        <w:t xml:space="preserve"> </w:t>
+      </w:r>
+      <w:r>
+        <w:rPr>
+          <w:lang w:val="fr_FR" w:bidi="fr_FR"/>
+        </w:rPr>
+        <w:t>bijoux, joyaux</w:t>
       </w:r>
       <w:r>
         <w:rPr>

</xml_diff>